<commit_message>
docs(figures): add black-and-white academic Visio/Draw.io line art diagrams for SSO-MFA flow and infrastructure
</commit_message>
<xml_diff>
--- a/release/Perencanaan_Strategis_SSO_MFA_AISM_2Col.docx
+++ b/release/Perencanaan_Strategis_SSO_MFA_AISM_2Col.docx
@@ -1758,6 +1758,60 @@
     <w:p>
       <w:pPr>
         <w:spacing w:before="120" w:after="40"/>
+        <w:jc w:val="center"/>
+      </w:pPr>
+      <w:r>
+        <w:drawing>
+          <wp:inline xmlns:a="http://schemas.openxmlformats.org/drawingml/2006/main" xmlns:pic="http://schemas.openxmlformats.org/drawingml/2006/picture">
+            <wp:extent cx="3017520" cy="1844040"/>
+            <wp:docPr id="1" name="Picture 1"/>
+            <wp:cNvGraphicFramePr>
+              <a:graphicFrameLocks noChangeAspect="1"/>
+            </wp:cNvGraphicFramePr>
+            <a:graphic>
+              <a:graphicData uri="http://schemas.openxmlformats.org/drawingml/2006/picture">
+                <pic:pic>
+                  <pic:nvPicPr>
+                    <pic:cNvPr id="0" name="fig1_alur_autentikasi_as_is_vs_to_be.jpg"/>
+                    <pic:cNvPicPr/>
+                  </pic:nvPicPr>
+                  <pic:blipFill>
+                    <a:blip r:embed="rId11"/>
+                    <a:stretch>
+                      <a:fillRect/>
+                    </a:stretch>
+                  </pic:blipFill>
+                  <pic:spPr>
+                    <a:xfrm>
+                      <a:off x="0" y="0"/>
+                      <a:ext cx="3017520" cy="1844040"/>
+                    </a:xfrm>
+                    <a:prstGeom prst="rect"/>
+                  </pic:spPr>
+                </pic:pic>
+              </a:graphicData>
+            </a:graphic>
+          </wp:inline>
+        </w:drawing>
+      </w:r>
+    </w:p>
+    <w:p>
+      <w:pPr>
+        <w:spacing w:before="40" w:after="120"/>
+        <w:jc w:val="center"/>
+      </w:pPr>
+      <w:r>
+        <w:rPr>
+          <w:rFonts w:ascii="Times New Roman" w:hAnsi="Times New Roman"/>
+          <w:i/>
+          <w:sz w:val="16"/>
+        </w:rPr>
+        <w:t>Fig. 1. Perbandingan alur autentikasi sebelum (As-Is) dan sesudah (To-Be) penerapan SSO terintegrasi MFA.</w:t>
+      </w:r>
+    </w:p>
+    <w:p>
+      <w:pPr>
+        <w:spacing w:before="120" w:after="40"/>
         <w:jc w:val="left"/>
       </w:pPr>
       <w:r>
@@ -1979,6 +2033,60 @@
           <w:sz w:val="19"/>
         </w:rPr>
         <w:t>Arsitektur target mengombinasikan perimeter keamanan terpadu di depan klaster Keycloak IdP: Reverse Proxy/WAF -&gt; Authentication Flow Engine dengan Required Actions Pipeline -&gt; Modul TOTP (RFC 6238) &amp; WebAuthn SPI -&gt; Penyimpanan Token Sesi Terenkripsi -&gt; Penerbitan Token OIDC/SAML ke 44 aplikasi klien. Tiga alur utama dirancang: (1) Alur Registrasi Pertama; (2) Alur Login Terproteksi TOTP/WebAuthn; dan (3) Alur Pemulihan Mandiri via Email.</w:t>
+      </w:r>
+    </w:p>
+    <w:p>
+      <w:pPr>
+        <w:spacing w:before="120" w:after="40"/>
+        <w:jc w:val="center"/>
+      </w:pPr>
+      <w:r>
+        <w:drawing>
+          <wp:inline xmlns:a="http://schemas.openxmlformats.org/drawingml/2006/main" xmlns:pic="http://schemas.openxmlformats.org/drawingml/2006/picture">
+            <wp:extent cx="3017520" cy="2011680"/>
+            <wp:docPr id="2" name="Picture 2"/>
+            <wp:cNvGraphicFramePr>
+              <a:graphicFrameLocks noChangeAspect="1"/>
+            </wp:cNvGraphicFramePr>
+            <a:graphic>
+              <a:graphicData uri="http://schemas.openxmlformats.org/drawingml/2006/picture">
+                <pic:pic>
+                  <pic:nvPicPr>
+                    <pic:cNvPr id="0" name="fig2_arsitektur_infrastruktur_sso_mfa.jpg"/>
+                    <pic:cNvPicPr/>
+                  </pic:nvPicPr>
+                  <pic:blipFill>
+                    <a:blip r:embed="rId12"/>
+                    <a:stretch>
+                      <a:fillRect/>
+                    </a:stretch>
+                  </pic:blipFill>
+                  <pic:spPr>
+                    <a:xfrm>
+                      <a:off x="0" y="0"/>
+                      <a:ext cx="3017520" cy="2011680"/>
+                    </a:xfrm>
+                    <a:prstGeom prst="rect"/>
+                  </pic:spPr>
+                </pic:pic>
+              </a:graphicData>
+            </a:graphic>
+          </wp:inline>
+        </w:drawing>
+      </w:r>
+    </w:p>
+    <w:p>
+      <w:pPr>
+        <w:spacing w:before="40" w:after="120"/>
+        <w:jc w:val="center"/>
+      </w:pPr>
+      <w:r>
+        <w:rPr>
+          <w:rFonts w:ascii="Times New Roman" w:hAnsi="Times New Roman"/>
+          <w:i/>
+          <w:sz w:val="16"/>
+        </w:rPr>
+        <w:t>Fig. 2. Cetak biru arsitektur infrastruktur konseptual target SSO terintegrasi Multi-Factor Authentication (MFA).</w:t>
       </w:r>
     </w:p>
     <w:p>

</xml_diff>